<commit_message>
20260716: report-card DOCX Formation page (gap G6) — mirrors MMIS page_formation.py section order (deportment tables per non-academic job_category ordered by sort_order, Grade Descriptors legend, Certificate of Transfer). Generic-by-category (title from job_category.name, zero vertical nouns); rows = frozen jos deportment averages (single Rating column; per-semester import = future); untaken strands suppressed via shared IsNonEnrolledCell. 6 tests green; live HTTP download verified (12/13 strands exact frozen values, Korean suppressed, zero template leaks).
Co-Authored-By: Claude Fable 5 <noreply@anthropic.com>
Claude-Session: https://claude.ai/code/session_011bPd3Lw1vFn34M4pLBU9yU
</commit_message>
<xml_diff>
--- a/domain/operation/outcome_summary/document/report-card-template.docx
+++ b/domain/operation/outcome_summary/document/report-card-template.docx
@@ -908,6 +908,545 @@
         </w:tc>
       </w:tr>
     </w:tbl>
+    <w:p>
+      <w:r>
+        <w:br w:type="page"/>
+      </w:r>
+    </w:p>
+    <w:p>
+      <w:pPr>
+        <w:spacing w:after="120"/>
+      </w:pPr>
+      <w:r>
+        <w:rPr>
+          <w:b/>
+          <w:color w:val="C00000"/>
+          <w:sz w:val="28"/>
+          <w:szCs w:val="28"/>
+        </w:rPr>
+        <w:t xml:space="preserve">STUDENT FORMATION</w:t>
+      </w:r>
+    </w:p>
+    <w:p>
+      <w:r>
+        <w:t xml:space="preserve">{{#formation_groups}}</w:t>
+      </w:r>
+    </w:p>
+    <w:p>
+      <w:pPr>
+        <w:spacing w:after="40"/>
+      </w:pPr>
+      <w:r>
+        <w:rPr>
+          <w:b/>
+          <w:color w:val="C00000"/>
+          <w:sz w:val="20"/>
+          <w:szCs w:val="20"/>
+        </w:rPr>
+        <w:t xml:space="preserve">{{category_title}}</w:t>
+      </w:r>
+    </w:p>
+    <w:tbl>
+      <w:tblPr>
+        <w:tblW w:w="5000" w:type="pct"/>
+        <w:tblBorders>
+          <w:top w:val="single" w:sz="4" w:space="0" w:color="808080"/>
+          <w:left w:val="single" w:sz="4" w:space="0" w:color="808080"/>
+          <w:bottom w:val="single" w:sz="4" w:space="0" w:color="808080"/>
+          <w:right w:val="single" w:sz="4" w:space="0" w:color="808080"/>
+          <w:insideH w:val="single" w:sz="4" w:space="0" w:color="808080"/>
+          <w:insideV w:val="single" w:sz="4" w:space="0" w:color="808080"/>
+        </w:tblBorders>
+      </w:tblPr>
+      <w:tblGrid>
+        <w:gridCol w:w="7000"/>
+        <w:gridCol w:w="2500"/>
+      </w:tblGrid>
+      <w:tr>
+        <w:tc>
+          <w:tcPr>
+            <w:tcW w:w="7000" w:type="dxa"/>
+            <w:shd w:val="clear" w:color="auto" w:fill="F2F2F2"/>
+            <w:vAlign w:val="center"/>
+          </w:tcPr>
+          <w:p>
+            <w:pPr>
+              <w:jc w:val="left"/>
+            </w:pPr>
+            <w:r>
+              <w:rPr>
+                <w:b/>
+                <w:color w:val="C00000"/>
+                <w:sz w:val="16"/>
+                <w:szCs w:val="16"/>
+              </w:rPr>
+              <w:t xml:space="preserve">Subject</w:t>
+            </w:r>
+          </w:p>
+        </w:tc>
+        <w:tc>
+          <w:tcPr>
+            <w:tcW w:w="2500" w:type="dxa"/>
+            <w:shd w:val="clear" w:color="auto" w:fill="F2F2F2"/>
+            <w:vAlign w:val="center"/>
+          </w:tcPr>
+          <w:p>
+            <w:pPr>
+              <w:jc w:val="center"/>
+            </w:pPr>
+            <w:r>
+              <w:rPr>
+                <w:b/>
+                <w:color w:val="C00000"/>
+                <w:sz w:val="16"/>
+                <w:szCs w:val="16"/>
+              </w:rPr>
+              <w:t xml:space="preserve">Rating</w:t>
+            </w:r>
+          </w:p>
+        </w:tc>
+      </w:tr>
+      <w:tr>
+        <w:tc>
+          <w:tcPr>
+            <w:tcW w:w="9500" w:type="dxa"/>
+            <w:vAlign w:val="center"/>
+          </w:tcPr>
+          <w:p>
+            <w:pPr>
+              <w:jc w:val="center"/>
+            </w:pPr>
+            <w:r>
+              <w:t xml:space="preserve">{{#rows}}</w:t>
+            </w:r>
+          </w:p>
+        </w:tc>
+      </w:tr>
+      <w:tr>
+        <w:tc>
+          <w:tcPr>
+            <w:tcW w:w="7000" w:type="dxa"/>
+            <w:vAlign w:val="center"/>
+          </w:tcPr>
+          <w:p>
+            <w:pPr>
+              <w:jc w:val="left"/>
+            </w:pPr>
+            <w:r>
+              <w:t xml:space="preserve">{{row_subject}}</w:t>
+            </w:r>
+          </w:p>
+        </w:tc>
+        <w:tc>
+          <w:tcPr>
+            <w:tcW w:w="2500" w:type="dxa"/>
+            <w:vAlign w:val="center"/>
+          </w:tcPr>
+          <w:p>
+            <w:pPr>
+              <w:jc w:val="center"/>
+            </w:pPr>
+            <w:r>
+              <w:rPr>
+                <w:b/>
+              </w:rPr>
+              <w:t xml:space="preserve">{{row_average}}</w:t>
+            </w:r>
+          </w:p>
+        </w:tc>
+      </w:tr>
+      <w:tr>
+        <w:tc>
+          <w:tcPr>
+            <w:tcW w:w="9500" w:type="dxa"/>
+            <w:vAlign w:val="center"/>
+          </w:tcPr>
+          <w:p>
+            <w:pPr>
+              <w:jc w:val="center"/>
+            </w:pPr>
+            <w:r>
+              <w:t xml:space="preserve">{{/rows}}</w:t>
+            </w:r>
+          </w:p>
+        </w:tc>
+      </w:tr>
+    </w:tbl>
+    <w:p>
+      <w:r>
+        <w:t xml:space="preserve">{{/formation_groups}}</w:t>
+      </w:r>
+    </w:p>
+    <w:p>
+      <w:pPr>
+        <w:spacing w:after="120"/>
+      </w:pPr>
+      <w:r>
+        <w:rPr>
+          <w:sz w:val="10"/>
+          <w:szCs w:val="10"/>
+        </w:rPr>
+        <w:t xml:space="preserve"/>
+      </w:r>
+    </w:p>
+    <w:p>
+      <w:pPr>
+        <w:spacing w:after="40"/>
+      </w:pPr>
+      <w:r>
+        <w:rPr>
+          <w:b/>
+          <w:color w:val="C00000"/>
+          <w:sz w:val="20"/>
+          <w:szCs w:val="20"/>
+        </w:rPr>
+        <w:t xml:space="preserve">Grade Descriptors</w:t>
+      </w:r>
+    </w:p>
+    <w:tbl>
+      <w:tblPr>
+        <w:tblW w:w="5000" w:type="pct"/>
+        <w:tblBorders>
+          <w:top w:val="single" w:sz="4" w:space="0" w:color="808080"/>
+          <w:left w:val="single" w:sz="4" w:space="0" w:color="808080"/>
+          <w:bottom w:val="single" w:sz="4" w:space="0" w:color="808080"/>
+          <w:right w:val="single" w:sz="4" w:space="0" w:color="808080"/>
+          <w:insideH w:val="single" w:sz="4" w:space="0" w:color="808080"/>
+          <w:insideV w:val="single" w:sz="4" w:space="0" w:color="808080"/>
+        </w:tblBorders>
+      </w:tblPr>
+      <w:tblGrid>
+        <w:gridCol w:w="3000"/>
+        <w:gridCol w:w="6000"/>
+      </w:tblGrid>
+      <w:tr>
+        <w:tc>
+          <w:tcPr>
+            <w:shd w:val="clear" w:color="auto" w:fill="F2F2F2"/>
+            <w:vAlign w:val="center"/>
+          </w:tcPr>
+          <w:p>
+            <w:pPr>
+              <w:jc w:val="left"/>
+            </w:pPr>
+            <w:r>
+              <w:rPr>
+                <w:b/>
+                <w:color w:val="C00000"/>
+                <w:sz w:val="16"/>
+                <w:szCs w:val="16"/>
+              </w:rPr>
+              <w:t xml:space="preserve">Grade Boundary</w:t>
+            </w:r>
+          </w:p>
+        </w:tc>
+        <w:tc>
+          <w:tcPr>
+            <w:shd w:val="clear" w:color="auto" w:fill="F2F2F2"/>
+            <w:vAlign w:val="center"/>
+          </w:tcPr>
+          <w:p>
+            <w:pPr>
+              <w:jc w:val="left"/>
+            </w:pPr>
+            <w:r>
+              <w:rPr>
+                <w:b/>
+                <w:color w:val="C00000"/>
+                <w:sz w:val="16"/>
+                <w:szCs w:val="16"/>
+              </w:rPr>
+              <w:t xml:space="preserve">Descriptors</w:t>
+            </w:r>
+          </w:p>
+        </w:tc>
+      </w:tr>
+      <w:tr>
+        <w:tc>
+          <w:tcPr>
+            <w:tcW w:w="3000" w:type="dxa"/>
+            <w:vAlign w:val="center"/>
+          </w:tcPr>
+          <w:p>
+            <w:pPr>
+              <w:jc w:val="left"/>
+            </w:pPr>
+            <w:r>
+              <w:t xml:space="preserve">90% - 100%</w:t>
+            </w:r>
+          </w:p>
+        </w:tc>
+        <w:tc>
+          <w:tcPr>
+            <w:tcW w:w="6000" w:type="dxa"/>
+            <w:vAlign w:val="center"/>
+          </w:tcPr>
+          <w:p>
+            <w:pPr>
+              <w:jc w:val="left"/>
+            </w:pPr>
+            <w:r>
+              <w:t xml:space="preserve">Outstanding (O)</w:t>
+            </w:r>
+          </w:p>
+        </w:tc>
+      </w:tr>
+      <w:tr>
+        <w:tc>
+          <w:tcPr>
+            <w:tcW w:w="3000" w:type="dxa"/>
+            <w:vAlign w:val="center"/>
+          </w:tcPr>
+          <w:p>
+            <w:pPr>
+              <w:jc w:val="left"/>
+            </w:pPr>
+            <w:r>
+              <w:t xml:space="preserve">85% - 89%</w:t>
+            </w:r>
+          </w:p>
+        </w:tc>
+        <w:tc>
+          <w:tcPr>
+            <w:tcW w:w="6000" w:type="dxa"/>
+            <w:vAlign w:val="center"/>
+          </w:tcPr>
+          <w:p>
+            <w:pPr>
+              <w:jc w:val="left"/>
+            </w:pPr>
+            <w:r>
+              <w:t xml:space="preserve">Very Satisfactory (VS)</w:t>
+            </w:r>
+          </w:p>
+        </w:tc>
+      </w:tr>
+      <w:tr>
+        <w:tc>
+          <w:tcPr>
+            <w:tcW w:w="3000" w:type="dxa"/>
+            <w:vAlign w:val="center"/>
+          </w:tcPr>
+          <w:p>
+            <w:pPr>
+              <w:jc w:val="left"/>
+            </w:pPr>
+            <w:r>
+              <w:t xml:space="preserve">80% - 84%</w:t>
+            </w:r>
+          </w:p>
+        </w:tc>
+        <w:tc>
+          <w:tcPr>
+            <w:tcW w:w="6000" w:type="dxa"/>
+            <w:vAlign w:val="center"/>
+          </w:tcPr>
+          <w:p>
+            <w:pPr>
+              <w:jc w:val="left"/>
+            </w:pPr>
+            <w:r>
+              <w:t xml:space="preserve">Satisfactory (S)</w:t>
+            </w:r>
+          </w:p>
+        </w:tc>
+      </w:tr>
+      <w:tr>
+        <w:tc>
+          <w:tcPr>
+            <w:tcW w:w="3000" w:type="dxa"/>
+            <w:vAlign w:val="center"/>
+          </w:tcPr>
+          <w:p>
+            <w:pPr>
+              <w:jc w:val="left"/>
+            </w:pPr>
+            <w:r>
+              <w:t xml:space="preserve">75% - 79%</w:t>
+            </w:r>
+          </w:p>
+        </w:tc>
+        <w:tc>
+          <w:tcPr>
+            <w:tcW w:w="6000" w:type="dxa"/>
+            <w:vAlign w:val="center"/>
+          </w:tcPr>
+          <w:p>
+            <w:pPr>
+              <w:jc w:val="left"/>
+            </w:pPr>
+            <w:r>
+              <w:t xml:space="preserve">Fairly Satisfactory (FS)</w:t>
+            </w:r>
+          </w:p>
+        </w:tc>
+      </w:tr>
+      <w:tr>
+        <w:tc>
+          <w:tcPr>
+            <w:tcW w:w="3000" w:type="dxa"/>
+            <w:vAlign w:val="center"/>
+          </w:tcPr>
+          <w:p>
+            <w:pPr>
+              <w:jc w:val="left"/>
+            </w:pPr>
+            <w:r>
+              <w:t xml:space="preserve">74% and below</w:t>
+            </w:r>
+          </w:p>
+        </w:tc>
+        <w:tc>
+          <w:tcPr>
+            <w:tcW w:w="6000" w:type="dxa"/>
+            <w:vAlign w:val="center"/>
+          </w:tcPr>
+          <w:p>
+            <w:pPr>
+              <w:jc w:val="left"/>
+            </w:pPr>
+            <w:r>
+              <w:t xml:space="preserve">Did not meet expectations (NM)</w:t>
+            </w:r>
+          </w:p>
+        </w:tc>
+      </w:tr>
+    </w:tbl>
+    <w:p>
+      <w:pPr>
+        <w:spacing w:after="200"/>
+      </w:pPr>
+      <w:r>
+        <w:rPr>
+          <w:sz w:val="10"/>
+          <w:szCs w:val="10"/>
+        </w:rPr>
+        <w:t xml:space="preserve"/>
+      </w:r>
+    </w:p>
+    <w:p>
+      <w:pPr>
+        <w:jc w:val="center"/>
+        <w:spacing w:after="120"/>
+      </w:pPr>
+      <w:r>
+        <w:rPr>
+          <w:b/>
+          <w:sz w:val="18"/>
+          <w:szCs w:val="18"/>
+        </w:rPr>
+        <w:t xml:space="preserve">CERTIFICATE OF TRANSFER</w:t>
+      </w:r>
+    </w:p>
+    <w:tbl>
+      <w:tblPr>
+        <w:tblW w:w="5000" w:type="pct"/>
+      </w:tblPr>
+      <w:tblGrid>
+        <w:gridCol w:w="4800"/>
+        <w:gridCol w:w="4800"/>
+      </w:tblGrid>
+      <w:tr>
+        <w:tc>
+          <w:tcPr>
+            <w:tcW w:w="4800" w:type="dxa"/>
+            <w:vAlign w:val="top"/>
+          </w:tcPr>
+          <w:p>
+            <w:pPr>
+              <w:spacing w:after="80"/>
+            </w:pPr>
+            <w:r>
+              <w:rPr>
+                <w:b/>
+              </w:rPr>
+              <w:t xml:space="preserve">Eligible for transfer and admission</w:t>
+            </w:r>
+          </w:p>
+          <w:p>
+            <w:pPr>
+              <w:spacing w:after="40"/>
+            </w:pPr>
+            <w:r>
+              <w:t xml:space="preserve">To: ________________________________</w:t>
+            </w:r>
+          </w:p>
+          <w:p>
+            <w:pPr>
+              <w:spacing w:after="200"/>
+            </w:pPr>
+            <w:r>
+              <w:t xml:space="preserve">Date: ________________________________</w:t>
+            </w:r>
+          </w:p>
+          <w:p>
+            <w:r>
+              <w:t xml:space="preserve">________________________________</w:t>
+            </w:r>
+          </w:p>
+          <w:p>
+            <w:r>
+              <w:t xml:space="preserve">School Principal</w:t>
+            </w:r>
+          </w:p>
+        </w:tc>
+        <w:tc>
+          <w:tcPr>
+            <w:tcW w:w="4800" w:type="dxa"/>
+            <w:vAlign w:val="top"/>
+          </w:tcPr>
+          <w:p>
+            <w:pPr>
+              <w:spacing w:after="80"/>
+            </w:pPr>
+            <w:r>
+              <w:rPr>
+                <w:b/>
+              </w:rPr>
+              <w:t xml:space="preserve">Cancellation of Transfer Eligibility</w:t>
+            </w:r>
+          </w:p>
+          <w:p>
+            <w:pPr>
+              <w:spacing w:after="40"/>
+            </w:pPr>
+            <w:r>
+              <w:t xml:space="preserve">Has been admitted to: ________________________________</w:t>
+            </w:r>
+          </w:p>
+          <w:p>
+            <w:pPr>
+              <w:spacing w:after="200"/>
+            </w:pPr>
+            <w:r>
+              <w:t xml:space="preserve">Date: ________________________________</w:t>
+            </w:r>
+          </w:p>
+          <w:p>
+            <w:r>
+              <w:t xml:space="preserve">________________________________</w:t>
+            </w:r>
+          </w:p>
+          <w:p>
+            <w:r>
+              <w:t xml:space="preserve">School Principal</w:t>
+            </w:r>
+          </w:p>
+        </w:tc>
+      </w:tr>
+    </w:tbl>
+    <w:p>
+      <w:pPr>
+        <w:spacing w:after="200"/>
+      </w:pPr>
+      <w:r>
+        <w:rPr>
+          <w:sz w:val="10"/>
+          <w:szCs w:val="10"/>
+        </w:rPr>
+        <w:t xml:space="preserve"/>
+      </w:r>
+    </w:p>
     <w:p>
       <w:pPr>
         <w:spacing w:after="200"/>

</xml_diff>